<commit_message>
docs: record round 1 answers and add follow-up questions to round 2
Co-Authored-By: Claude Sonnet 5.5 <noreply@anthropic.com>
</commit_message>
<xml_diff>
--- a/docs/design/02_game_questions_round2.docx
+++ b/docs/design/02_game_questions_round2.docx
@@ -41,7 +41,7 @@
           <w:sz w:val="24"/>
           <w:szCs w:val="24"/>
         </w:rPr>
-        <w:t xml:space="preserve">These questions fill in the details of the game. There are no wrong answers. Write short answers under each question. If you are not sure, write "not sure" and we can come back to it. Round 1 has the big questions.</w:t>
+        <w:t xml:space="preserve">These questions fill in the details of the game. There are no wrong answers. Write short answers under each question. If you are not sure, write "not sure" and we can come back to it. Round 1 has the big questions, and these new questions follow up on your round 1 answers.</w:t>
       </w:r>
     </w:p>
     <w:p>
@@ -1114,6 +1114,828 @@
           <w:szCs w:val="24"/>
         </w:rPr>
         <w:t xml:space="preserve">Is there a favorite part of the game that you can already picture? Tell us about it.</w:t>
+      </w:r>
+    </w:p>
+    <w:p>
+      <w:pPr>
+        <w:keepNext/>
+        <w:keepLines/>
+        <w:pBdr>
+          <w:bottom w:val="single" w:color="555555" w:sz="6" w:space="1"/>
+        </w:pBdr>
+        <w:spacing w:after="0" w:before="0" w:line="560" w:lineRule="exact"/>
+      </w:pPr>
+    </w:p>
+    <w:p>
+      <w:pPr>
+        <w:keepNext w:val="false"/>
+        <w:keepLines/>
+        <w:pBdr>
+          <w:bottom w:val="single" w:color="555556" w:sz="6" w:space="1"/>
+        </w:pBdr>
+        <w:spacing w:after="0" w:before="0" w:line="560" w:lineRule="exact"/>
+      </w:pPr>
+    </w:p>
+    <w:p>
+      <w:pPr>
+        <w:pStyle w:val="Heading1"/>
+        <w:keepNext/>
+        <w:spacing w:after="80" w:before="360"/>
+      </w:pPr>
+      <w:r>
+        <w:rPr>
+          <w:rFonts w:ascii="Arial" w:cs="Arial" w:eastAsia="Arial" w:hAnsi="Arial"/>
+          <w:b/>
+          <w:bCs/>
+          <w:sz w:val="30"/>
+          <w:szCs w:val="30"/>
+        </w:rPr>
+        <w:t xml:space="preserve">Tasks and achievements</w:t>
+      </w:r>
+    </w:p>
+    <w:p>
+      <w:pPr>
+        <w:keepNext/>
+        <w:spacing w:after="0" w:before="240"/>
+        <w:ind w:left="360" w:hanging="360"/>
+      </w:pPr>
+      <w:r>
+        <w:rPr>
+          <w:rFonts w:ascii="Arial" w:cs="Arial" w:eastAsia="Arial" w:hAnsi="Arial"/>
+          <w:b/>
+          <w:bCs/>
+          <w:sz w:val="24"/>
+          <w:szCs w:val="24"/>
+        </w:rPr>
+        <w:t xml:space="preserve">38.  </w:t>
+      </w:r>
+      <w:r>
+        <w:rPr>
+          <w:rFonts w:ascii="Arial" w:cs="Arial" w:eastAsia="Arial" w:hAnsi="Arial"/>
+          <w:sz w:val="24"/>
+          <w:szCs w:val="24"/>
+        </w:rPr>
+        <w:t xml:space="preserve">The goal is to complete each task and get every achievement. What are some tasks the beaver has to do?</w:t>
+      </w:r>
+    </w:p>
+    <w:p>
+      <w:pPr>
+        <w:keepNext/>
+        <w:keepLines/>
+        <w:pBdr>
+          <w:bottom w:val="single" w:color="555555" w:sz="6" w:space="1"/>
+        </w:pBdr>
+        <w:spacing w:after="0" w:before="0" w:line="560" w:lineRule="exact"/>
+      </w:pPr>
+    </w:p>
+    <w:p>
+      <w:pPr>
+        <w:keepNext w:val="false"/>
+        <w:keepLines/>
+        <w:pBdr>
+          <w:bottom w:val="single" w:color="555556" w:sz="6" w:space="1"/>
+        </w:pBdr>
+        <w:spacing w:after="0" w:before="0" w:line="560" w:lineRule="exact"/>
+      </w:pPr>
+    </w:p>
+    <w:p>
+      <w:pPr>
+        <w:keepNext/>
+        <w:spacing w:after="0" w:before="240"/>
+        <w:ind w:left="360" w:hanging="360"/>
+      </w:pPr>
+      <w:r>
+        <w:rPr>
+          <w:rFonts w:ascii="Arial" w:cs="Arial" w:eastAsia="Arial" w:hAnsi="Arial"/>
+          <w:b/>
+          <w:bCs/>
+          <w:sz w:val="24"/>
+          <w:szCs w:val="24"/>
+        </w:rPr>
+        <w:t xml:space="preserve">39.  </w:t>
+      </w:r>
+      <w:r>
+        <w:rPr>
+          <w:rFonts w:ascii="Arial" w:cs="Arial" w:eastAsia="Arial" w:hAnsi="Arial"/>
+          <w:sz w:val="24"/>
+          <w:szCs w:val="24"/>
+        </w:rPr>
+        <w:t xml:space="preserve">What is one achievement you can already picture? What would it be called?</w:t>
+      </w:r>
+    </w:p>
+    <w:p>
+      <w:pPr>
+        <w:keepNext/>
+        <w:keepLines/>
+        <w:pBdr>
+          <w:bottom w:val="single" w:color="555555" w:sz="6" w:space="1"/>
+        </w:pBdr>
+        <w:spacing w:after="0" w:before="0" w:line="560" w:lineRule="exact"/>
+      </w:pPr>
+    </w:p>
+    <w:p>
+      <w:pPr>
+        <w:keepNext w:val="false"/>
+        <w:keepLines/>
+        <w:pBdr>
+          <w:bottom w:val="single" w:color="555556" w:sz="6" w:space="1"/>
+        </w:pBdr>
+        <w:spacing w:after="0" w:before="0" w:line="560" w:lineRule="exact"/>
+      </w:pPr>
+    </w:p>
+    <w:p>
+      <w:pPr>
+        <w:keepNext/>
+        <w:spacing w:after="0" w:before="240"/>
+        <w:ind w:left="360" w:hanging="360"/>
+      </w:pPr>
+      <w:r>
+        <w:rPr>
+          <w:rFonts w:ascii="Arial" w:cs="Arial" w:eastAsia="Arial" w:hAnsi="Arial"/>
+          <w:b/>
+          <w:bCs/>
+          <w:sz w:val="24"/>
+          <w:szCs w:val="24"/>
+        </w:rPr>
+        <w:t xml:space="preserve">40.  </w:t>
+      </w:r>
+      <w:r>
+        <w:rPr>
+          <w:rFonts w:ascii="Arial" w:cs="Arial" w:eastAsia="Arial" w:hAnsi="Arial"/>
+          <w:sz w:val="24"/>
+          <w:szCs w:val="24"/>
+        </w:rPr>
+        <w:t xml:space="preserve">What happens when you have finished every task and got every achievement? Does the game end, or can you keep playing?</w:t>
+      </w:r>
+    </w:p>
+    <w:p>
+      <w:pPr>
+        <w:keepNext/>
+        <w:keepLines/>
+        <w:pBdr>
+          <w:bottom w:val="single" w:color="555555" w:sz="6" w:space="1"/>
+        </w:pBdr>
+        <w:spacing w:after="0" w:before="0" w:line="560" w:lineRule="exact"/>
+      </w:pPr>
+    </w:p>
+    <w:p>
+      <w:pPr>
+        <w:keepNext w:val="false"/>
+        <w:keepLines/>
+        <w:pBdr>
+          <w:bottom w:val="single" w:color="555556" w:sz="6" w:space="1"/>
+        </w:pBdr>
+        <w:spacing w:after="0" w:before="0" w:line="560" w:lineRule="exact"/>
+      </w:pPr>
+    </w:p>
+    <w:p>
+      <w:pPr>
+        <w:pStyle w:val="Heading1"/>
+        <w:keepNext/>
+        <w:spacing w:after="80" w:before="360"/>
+      </w:pPr>
+      <w:r>
+        <w:rPr>
+          <w:rFonts w:ascii="Arial" w:cs="Arial" w:eastAsia="Arial" w:hAnsi="Arial"/>
+          <w:b/>
+          <w:bCs/>
+          <w:sz w:val="30"/>
+          <w:szCs w:val="30"/>
+        </w:rPr>
+        <w:t xml:space="preserve">Playing with friends</w:t>
+      </w:r>
+    </w:p>
+    <w:p>
+      <w:pPr>
+        <w:keepNext/>
+        <w:spacing w:after="0" w:before="240"/>
+        <w:ind w:left="360" w:hanging="360"/>
+      </w:pPr>
+      <w:r>
+        <w:rPr>
+          <w:rFonts w:ascii="Arial" w:cs="Arial" w:eastAsia="Arial" w:hAnsi="Arial"/>
+          <w:b/>
+          <w:bCs/>
+          <w:sz w:val="24"/>
+          <w:szCs w:val="24"/>
+        </w:rPr>
+        <w:t xml:space="preserve">41.  </w:t>
+      </w:r>
+      <w:r>
+        <w:rPr>
+          <w:rFonts w:ascii="Arial" w:cs="Arial" w:eastAsia="Arial" w:hAnsi="Arial"/>
+          <w:sz w:val="24"/>
+          <w:szCs w:val="24"/>
+        </w:rPr>
+        <w:t xml:space="preserve">Friends can play together with different players. What does "different players" mean? Is each friend a different beaver in the same family?</w:t>
+      </w:r>
+    </w:p>
+    <w:p>
+      <w:pPr>
+        <w:keepNext/>
+        <w:keepLines/>
+        <w:pBdr>
+          <w:bottom w:val="single" w:color="555555" w:sz="6" w:space="1"/>
+        </w:pBdr>
+        <w:spacing w:after="0" w:before="0" w:line="560" w:lineRule="exact"/>
+      </w:pPr>
+    </w:p>
+    <w:p>
+      <w:pPr>
+        <w:keepNext w:val="false"/>
+        <w:keepLines/>
+        <w:pBdr>
+          <w:bottom w:val="single" w:color="555556" w:sz="6" w:space="1"/>
+        </w:pBdr>
+        <w:spacing w:after="0" w:before="0" w:line="560" w:lineRule="exact"/>
+      </w:pPr>
+    </w:p>
+    <w:p>
+      <w:pPr>
+        <w:pStyle w:val="Heading1"/>
+        <w:keepNext/>
+        <w:spacing w:after="80" w:before="360"/>
+      </w:pPr>
+      <w:r>
+        <w:rPr>
+          <w:rFonts w:ascii="Arial" w:cs="Arial" w:eastAsia="Arial" w:hAnsi="Arial"/>
+          <w:b/>
+          <w:bCs/>
+          <w:sz w:val="30"/>
+          <w:szCs w:val="30"/>
+        </w:rPr>
+        <w:t xml:space="preserve">Dreams and side quests</w:t>
+      </w:r>
+    </w:p>
+    <w:p>
+      <w:pPr>
+        <w:keepNext/>
+        <w:spacing w:after="0" w:before="240"/>
+        <w:ind w:left="360" w:hanging="360"/>
+      </w:pPr>
+      <w:r>
+        <w:rPr>
+          <w:rFonts w:ascii="Arial" w:cs="Arial" w:eastAsia="Arial" w:hAnsi="Arial"/>
+          <w:b/>
+          <w:bCs/>
+          <w:sz w:val="24"/>
+          <w:szCs w:val="24"/>
+        </w:rPr>
+        <w:t xml:space="preserve">42.  </w:t>
+      </w:r>
+      <w:r>
+        <w:rPr>
+          <w:rFonts w:ascii="Arial" w:cs="Arial" w:eastAsia="Arial" w:hAnsi="Arial"/>
+          <w:sz w:val="24"/>
+          <w:szCs w:val="24"/>
+        </w:rPr>
+        <w:t xml:space="preserve">How does the beaver go into a dream? Does it happen when it sleeps?</w:t>
+      </w:r>
+    </w:p>
+    <w:p>
+      <w:pPr>
+        <w:keepNext/>
+        <w:keepLines/>
+        <w:pBdr>
+          <w:bottom w:val="single" w:color="555555" w:sz="6" w:space="1"/>
+        </w:pBdr>
+        <w:spacing w:after="0" w:before="0" w:line="560" w:lineRule="exact"/>
+      </w:pPr>
+    </w:p>
+    <w:p>
+      <w:pPr>
+        <w:keepNext w:val="false"/>
+        <w:keepLines/>
+        <w:pBdr>
+          <w:bottom w:val="single" w:color="555556" w:sz="6" w:space="1"/>
+        </w:pBdr>
+        <w:spacing w:after="0" w:before="0" w:line="560" w:lineRule="exact"/>
+      </w:pPr>
+    </w:p>
+    <w:p>
+      <w:pPr>
+        <w:keepNext/>
+        <w:spacing w:after="0" w:before="240"/>
+        <w:ind w:left="360" w:hanging="360"/>
+      </w:pPr>
+      <w:r>
+        <w:rPr>
+          <w:rFonts w:ascii="Arial" w:cs="Arial" w:eastAsia="Arial" w:hAnsi="Arial"/>
+          <w:b/>
+          <w:bCs/>
+          <w:sz w:val="24"/>
+          <w:szCs w:val="24"/>
+        </w:rPr>
+        <w:t xml:space="preserve">43.  </w:t>
+      </w:r>
+      <w:r>
+        <w:rPr>
+          <w:rFonts w:ascii="Arial" w:cs="Arial" w:eastAsia="Arial" w:hAnsi="Arial"/>
+          <w:sz w:val="24"/>
+          <w:szCs w:val="24"/>
+        </w:rPr>
+        <w:t xml:space="preserve">What happens in a dream side quest? Tell us about one you can picture.</w:t>
+      </w:r>
+    </w:p>
+    <w:p>
+      <w:pPr>
+        <w:keepNext/>
+        <w:keepLines/>
+        <w:pBdr>
+          <w:bottom w:val="single" w:color="555555" w:sz="6" w:space="1"/>
+        </w:pBdr>
+        <w:spacing w:after="0" w:before="0" w:line="560" w:lineRule="exact"/>
+      </w:pPr>
+    </w:p>
+    <w:p>
+      <w:pPr>
+        <w:keepNext w:val="false"/>
+        <w:keepLines/>
+        <w:pBdr>
+          <w:bottom w:val="single" w:color="555556" w:sz="6" w:space="1"/>
+        </w:pBdr>
+        <w:spacing w:after="0" w:before="0" w:line="560" w:lineRule="exact"/>
+      </w:pPr>
+    </w:p>
+    <w:p>
+      <w:pPr>
+        <w:pStyle w:val="Heading1"/>
+        <w:keepNext/>
+        <w:spacing w:after="80" w:before="360"/>
+      </w:pPr>
+      <w:r>
+        <w:rPr>
+          <w:rFonts w:ascii="Arial" w:cs="Arial" w:eastAsia="Arial" w:hAnsi="Arial"/>
+          <w:b/>
+          <w:bCs/>
+          <w:sz w:val="30"/>
+          <w:szCs w:val="30"/>
+        </w:rPr>
+        <w:t xml:space="preserve">Seasons</w:t>
+      </w:r>
+    </w:p>
+    <w:p>
+      <w:pPr>
+        <w:keepNext/>
+        <w:spacing w:after="0" w:before="240"/>
+        <w:ind w:left="360" w:hanging="360"/>
+      </w:pPr>
+      <w:r>
+        <w:rPr>
+          <w:rFonts w:ascii="Arial" w:cs="Arial" w:eastAsia="Arial" w:hAnsi="Arial"/>
+          <w:b/>
+          <w:bCs/>
+          <w:sz w:val="24"/>
+          <w:szCs w:val="24"/>
+        </w:rPr>
+        <w:t xml:space="preserve">44.  </w:t>
+      </w:r>
+      <w:r>
+        <w:rPr>
+          <w:rFonts w:ascii="Arial" w:cs="Arial" w:eastAsia="Arial" w:hAnsi="Arial"/>
+          <w:sz w:val="24"/>
+          <w:szCs w:val="24"/>
+        </w:rPr>
+        <w:t xml:space="preserve">What are the seasons, and what changes in each one? Think about snow, ice on the pond, and food.</w:t>
+      </w:r>
+    </w:p>
+    <w:p>
+      <w:pPr>
+        <w:keepNext/>
+        <w:keepLines/>
+        <w:pBdr>
+          <w:bottom w:val="single" w:color="555555" w:sz="6" w:space="1"/>
+        </w:pBdr>
+        <w:spacing w:after="0" w:before="0" w:line="560" w:lineRule="exact"/>
+      </w:pPr>
+    </w:p>
+    <w:p>
+      <w:pPr>
+        <w:keepNext w:val="false"/>
+        <w:keepLines/>
+        <w:pBdr>
+          <w:bottom w:val="single" w:color="555556" w:sz="6" w:space="1"/>
+        </w:pBdr>
+        <w:spacing w:after="0" w:before="0" w:line="560" w:lineRule="exact"/>
+      </w:pPr>
+    </w:p>
+    <w:p>
+      <w:pPr>
+        <w:keepNext/>
+        <w:spacing w:after="0" w:before="240"/>
+        <w:ind w:left="360" w:hanging="360"/>
+      </w:pPr>
+      <w:r>
+        <w:rPr>
+          <w:rFonts w:ascii="Arial" w:cs="Arial" w:eastAsia="Arial" w:hAnsi="Arial"/>
+          <w:b/>
+          <w:bCs/>
+          <w:sz w:val="24"/>
+          <w:szCs w:val="24"/>
+        </w:rPr>
+        <w:t xml:space="preserve">45.  </w:t>
+      </w:r>
+      <w:r>
+        <w:rPr>
+          <w:rFonts w:ascii="Arial" w:cs="Arial" w:eastAsia="Arial" w:hAnsi="Arial"/>
+          <w:sz w:val="24"/>
+          <w:szCs w:val="24"/>
+        </w:rPr>
+        <w:t xml:space="preserve">What does the family do in winter? Where do the lily pads go?</w:t>
+      </w:r>
+    </w:p>
+    <w:p>
+      <w:pPr>
+        <w:keepNext/>
+        <w:keepLines/>
+        <w:pBdr>
+          <w:bottom w:val="single" w:color="555555" w:sz="6" w:space="1"/>
+        </w:pBdr>
+        <w:spacing w:after="0" w:before="0" w:line="560" w:lineRule="exact"/>
+      </w:pPr>
+    </w:p>
+    <w:p>
+      <w:pPr>
+        <w:keepNext w:val="false"/>
+        <w:keepLines/>
+        <w:pBdr>
+          <w:bottom w:val="single" w:color="555556" w:sz="6" w:space="1"/>
+        </w:pBdr>
+        <w:spacing w:after="0" w:before="0" w:line="560" w:lineRule="exact"/>
+      </w:pPr>
+    </w:p>
+    <w:p>
+      <w:pPr>
+        <w:keepNext/>
+        <w:spacing w:after="0" w:before="240"/>
+        <w:ind w:left="360" w:hanging="360"/>
+      </w:pPr>
+      <w:r>
+        <w:rPr>
+          <w:rFonts w:ascii="Arial" w:cs="Arial" w:eastAsia="Arial" w:hAnsi="Arial"/>
+          <w:b/>
+          <w:bCs/>
+          <w:sz w:val="24"/>
+          <w:szCs w:val="24"/>
+        </w:rPr>
+        <w:t xml:space="preserve">46.  </w:t>
+      </w:r>
+      <w:r>
+        <w:rPr>
+          <w:rFonts w:ascii="Arial" w:cs="Arial" w:eastAsia="Arial" w:hAnsi="Arial"/>
+          <w:sz w:val="24"/>
+          <w:szCs w:val="24"/>
+        </w:rPr>
+        <w:t xml:space="preserve">Does the game change when a season changes, or does it change slowly?</w:t>
+      </w:r>
+    </w:p>
+    <w:p>
+      <w:pPr>
+        <w:keepNext/>
+        <w:keepLines/>
+        <w:pBdr>
+          <w:bottom w:val="single" w:color="555555" w:sz="6" w:space="1"/>
+        </w:pBdr>
+        <w:spacing w:after="0" w:before="0" w:line="560" w:lineRule="exact"/>
+      </w:pPr>
+    </w:p>
+    <w:p>
+      <w:pPr>
+        <w:keepNext w:val="false"/>
+        <w:keepLines/>
+        <w:pBdr>
+          <w:bottom w:val="single" w:color="555556" w:sz="6" w:space="1"/>
+        </w:pBdr>
+        <w:spacing w:after="0" w:before="0" w:line="560" w:lineRule="exact"/>
+      </w:pPr>
+    </w:p>
+    <w:p>
+      <w:pPr>
+        <w:pStyle w:val="Heading1"/>
+        <w:keepNext/>
+        <w:spacing w:after="80" w:before="360"/>
+      </w:pPr>
+      <w:r>
+        <w:rPr>
+          <w:rFonts w:ascii="Arial" w:cs="Arial" w:eastAsia="Arial" w:hAnsi="Arial"/>
+          <w:b/>
+          <w:bCs/>
+          <w:sz w:val="30"/>
+          <w:szCs w:val="30"/>
+        </w:rPr>
+        <w:t xml:space="preserve">Growing up and the family</w:t>
+      </w:r>
+    </w:p>
+    <w:p>
+      <w:pPr>
+        <w:keepNext/>
+        <w:spacing w:after="0" w:before="240"/>
+        <w:ind w:left="360" w:hanging="360"/>
+      </w:pPr>
+      <w:r>
+        <w:rPr>
+          <w:rFonts w:ascii="Arial" w:cs="Arial" w:eastAsia="Arial" w:hAnsi="Arial"/>
+          <w:b/>
+          <w:bCs/>
+          <w:sz w:val="24"/>
+          <w:szCs w:val="24"/>
+        </w:rPr>
+        <w:t xml:space="preserve">47.  </w:t>
+      </w:r>
+      <w:r>
+        <w:rPr>
+          <w:rFonts w:ascii="Arial" w:cs="Arial" w:eastAsia="Arial" w:hAnsi="Arial"/>
+          <w:sz w:val="24"/>
+          <w:szCs w:val="24"/>
+        </w:rPr>
+        <w:t xml:space="preserve">A baby takes one year to become a teenager. Do you play the whole year, or does time jump ahead?</w:t>
+      </w:r>
+    </w:p>
+    <w:p>
+      <w:pPr>
+        <w:keepNext/>
+        <w:keepLines/>
+        <w:pBdr>
+          <w:bottom w:val="single" w:color="555555" w:sz="6" w:space="1"/>
+        </w:pBdr>
+        <w:spacing w:after="0" w:before="0" w:line="560" w:lineRule="exact"/>
+      </w:pPr>
+    </w:p>
+    <w:p>
+      <w:pPr>
+        <w:keepNext w:val="false"/>
+        <w:keepLines/>
+        <w:pBdr>
+          <w:bottom w:val="single" w:color="555556" w:sz="6" w:space="1"/>
+        </w:pBdr>
+        <w:spacing w:after="0" w:before="0" w:line="560" w:lineRule="exact"/>
+      </w:pPr>
+    </w:p>
+    <w:p>
+      <w:pPr>
+        <w:keepNext/>
+        <w:spacing w:after="0" w:before="240"/>
+        <w:ind w:left="360" w:hanging="360"/>
+      </w:pPr>
+      <w:r>
+        <w:rPr>
+          <w:rFonts w:ascii="Arial" w:cs="Arial" w:eastAsia="Arial" w:hAnsi="Arial"/>
+          <w:b/>
+          <w:bCs/>
+          <w:sz w:val="24"/>
+          <w:szCs w:val="24"/>
+        </w:rPr>
+        <w:t xml:space="preserve">48.  </w:t>
+      </w:r>
+      <w:r>
+        <w:rPr>
+          <w:rFonts w:ascii="Arial" w:cs="Arial" w:eastAsia="Arial" w:hAnsi="Arial"/>
+          <w:sz w:val="24"/>
+          <w:szCs w:val="24"/>
+        </w:rPr>
+        <w:t xml:space="preserve">Teenagers help out around the pond. What jobs do they do?</w:t>
+      </w:r>
+    </w:p>
+    <w:p>
+      <w:pPr>
+        <w:keepNext/>
+        <w:keepLines/>
+        <w:pBdr>
+          <w:bottom w:val="single" w:color="555555" w:sz="6" w:space="1"/>
+        </w:pBdr>
+        <w:spacing w:after="0" w:before="0" w:line="560" w:lineRule="exact"/>
+      </w:pPr>
+    </w:p>
+    <w:p>
+      <w:pPr>
+        <w:keepNext w:val="false"/>
+        <w:keepLines/>
+        <w:pBdr>
+          <w:bottom w:val="single" w:color="555556" w:sz="6" w:space="1"/>
+        </w:pBdr>
+        <w:spacing w:after="0" w:before="0" w:line="560" w:lineRule="exact"/>
+      </w:pPr>
+    </w:p>
+    <w:p>
+      <w:pPr>
+        <w:keepNext/>
+        <w:spacing w:after="0" w:before="240"/>
+        <w:ind w:left="360" w:hanging="360"/>
+      </w:pPr>
+      <w:r>
+        <w:rPr>
+          <w:rFonts w:ascii="Arial" w:cs="Arial" w:eastAsia="Arial" w:hAnsi="Arial"/>
+          <w:b/>
+          <w:bCs/>
+          <w:sz w:val="24"/>
+          <w:szCs w:val="24"/>
+        </w:rPr>
+        <w:t xml:space="preserve">49.  </w:t>
+      </w:r>
+      <w:r>
+        <w:rPr>
+          <w:rFonts w:ascii="Arial" w:cs="Arial" w:eastAsia="Arial" w:hAnsi="Arial"/>
+          <w:sz w:val="24"/>
+          <w:szCs w:val="24"/>
+        </w:rPr>
+        <w:t xml:space="preserve">What does papa beaver do?</w:t>
+      </w:r>
+    </w:p>
+    <w:p>
+      <w:pPr>
+        <w:keepNext/>
+        <w:keepLines/>
+        <w:pBdr>
+          <w:bottom w:val="single" w:color="555555" w:sz="6" w:space="1"/>
+        </w:pBdr>
+        <w:spacing w:after="0" w:before="0" w:line="560" w:lineRule="exact"/>
+      </w:pPr>
+    </w:p>
+    <w:p>
+      <w:pPr>
+        <w:keepNext w:val="false"/>
+        <w:keepLines/>
+        <w:pBdr>
+          <w:bottom w:val="single" w:color="555556" w:sz="6" w:space="1"/>
+        </w:pBdr>
+        <w:spacing w:after="0" w:before="0" w:line="560" w:lineRule="exact"/>
+      </w:pPr>
+    </w:p>
+    <w:p>
+      <w:pPr>
+        <w:keepNext/>
+        <w:spacing w:after="0" w:before="240"/>
+        <w:ind w:left="360" w:hanging="360"/>
+      </w:pPr>
+      <w:r>
+        <w:rPr>
+          <w:rFonts w:ascii="Arial" w:cs="Arial" w:eastAsia="Arial" w:hAnsi="Arial"/>
+          <w:b/>
+          <w:bCs/>
+          <w:sz w:val="24"/>
+          <w:szCs w:val="24"/>
+        </w:rPr>
+        <w:t xml:space="preserve">50.  </w:t>
+      </w:r>
+      <w:r>
+        <w:rPr>
+          <w:rFonts w:ascii="Arial" w:cs="Arial" w:eastAsia="Arial" w:hAnsi="Arial"/>
+          <w:sz w:val="24"/>
+          <w:szCs w:val="24"/>
+        </w:rPr>
+        <w:t xml:space="preserve">The teenager stays one more year, and then starts a family of its own. How do you know it is time to go? Does the family say goodbye?</w:t>
+      </w:r>
+    </w:p>
+    <w:p>
+      <w:pPr>
+        <w:keepNext/>
+        <w:keepLines/>
+        <w:pBdr>
+          <w:bottom w:val="single" w:color="555555" w:sz="6" w:space="1"/>
+        </w:pBdr>
+        <w:spacing w:after="0" w:before="0" w:line="560" w:lineRule="exact"/>
+      </w:pPr>
+    </w:p>
+    <w:p>
+      <w:pPr>
+        <w:keepNext w:val="false"/>
+        <w:keepLines/>
+        <w:pBdr>
+          <w:bottom w:val="single" w:color="555556" w:sz="6" w:space="1"/>
+        </w:pBdr>
+        <w:spacing w:after="0" w:before="0" w:line="560" w:lineRule="exact"/>
+      </w:pPr>
+    </w:p>
+    <w:p>
+      <w:pPr>
+        <w:pStyle w:val="Heading1"/>
+        <w:keepNext/>
+        <w:spacing w:after="80" w:before="360"/>
+      </w:pPr>
+      <w:r>
+        <w:rPr>
+          <w:rFonts w:ascii="Arial" w:cs="Arial" w:eastAsia="Arial" w:hAnsi="Arial"/>
+          <w:b/>
+          <w:bCs/>
+          <w:sz w:val="30"/>
+          <w:szCs w:val="30"/>
+        </w:rPr>
+        <w:t xml:space="preserve">Guides and rescues</w:t>
+      </w:r>
+    </w:p>
+    <w:p>
+      <w:pPr>
+        <w:keepNext/>
+        <w:spacing w:after="0" w:before="240"/>
+        <w:ind w:left="360" w:hanging="360"/>
+      </w:pPr>
+      <w:r>
+        <w:rPr>
+          <w:rFonts w:ascii="Arial" w:cs="Arial" w:eastAsia="Arial" w:hAnsi="Arial"/>
+          <w:b/>
+          <w:bCs/>
+          <w:sz w:val="24"/>
+          <w:szCs w:val="24"/>
+        </w:rPr>
+        <w:t xml:space="preserve">51.  </w:t>
+      </w:r>
+      <w:r>
+        <w:rPr>
+          <w:rFonts w:ascii="Arial" w:cs="Arial" w:eastAsia="Arial" w:hAnsi="Arial"/>
+          <w:sz w:val="24"/>
+          <w:szCs w:val="24"/>
+        </w:rPr>
+        <w:t xml:space="preserve">A stuck beaver is not the player, but it can become your guide once you rescue it. What does a guide do for you?</w:t>
+      </w:r>
+    </w:p>
+    <w:p>
+      <w:pPr>
+        <w:keepNext/>
+        <w:keepLines/>
+        <w:pBdr>
+          <w:bottom w:val="single" w:color="555555" w:sz="6" w:space="1"/>
+        </w:pBdr>
+        <w:spacing w:after="0" w:before="0" w:line="560" w:lineRule="exact"/>
+      </w:pPr>
+    </w:p>
+    <w:p>
+      <w:pPr>
+        <w:keepNext w:val="false"/>
+        <w:keepLines/>
+        <w:pBdr>
+          <w:bottom w:val="single" w:color="555556" w:sz="6" w:space="1"/>
+        </w:pBdr>
+        <w:spacing w:after="0" w:before="0" w:line="560" w:lineRule="exact"/>
+      </w:pPr>
+    </w:p>
+    <w:p>
+      <w:pPr>
+        <w:keepNext/>
+        <w:spacing w:after="0" w:before="240"/>
+        <w:ind w:left="360" w:hanging="360"/>
+      </w:pPr>
+      <w:r>
+        <w:rPr>
+          <w:rFonts w:ascii="Arial" w:cs="Arial" w:eastAsia="Arial" w:hAnsi="Arial"/>
+          <w:b/>
+          <w:bCs/>
+          <w:sz w:val="24"/>
+          <w:szCs w:val="24"/>
+        </w:rPr>
+        <w:t xml:space="preserve">52.  </w:t>
+      </w:r>
+      <w:r>
+        <w:rPr>
+          <w:rFonts w:ascii="Arial" w:cs="Arial" w:eastAsia="Arial" w:hAnsi="Arial"/>
+          <w:sz w:val="24"/>
+          <w:szCs w:val="24"/>
+        </w:rPr>
+        <w:t xml:space="preserve">How do you rescue a stuck beaver? What does the player do?</w:t>
+      </w:r>
+    </w:p>
+    <w:p>
+      <w:pPr>
+        <w:keepNext/>
+        <w:keepLines/>
+        <w:pBdr>
+          <w:bottom w:val="single" w:color="555555" w:sz="6" w:space="1"/>
+        </w:pBdr>
+        <w:spacing w:after="0" w:before="0" w:line="560" w:lineRule="exact"/>
+      </w:pPr>
+    </w:p>
+    <w:p>
+      <w:pPr>
+        <w:keepNext w:val="false"/>
+        <w:keepLines/>
+        <w:pBdr>
+          <w:bottom w:val="single" w:color="555556" w:sz="6" w:space="1"/>
+        </w:pBdr>
+        <w:spacing w:after="0" w:before="0" w:line="560" w:lineRule="exact"/>
+      </w:pPr>
+    </w:p>
+    <w:p>
+      <w:pPr>
+        <w:keepNext/>
+        <w:spacing w:after="0" w:before="240"/>
+        <w:ind w:left="360" w:hanging="360"/>
+      </w:pPr>
+      <w:r>
+        <w:rPr>
+          <w:rFonts w:ascii="Arial" w:cs="Arial" w:eastAsia="Arial" w:hAnsi="Arial"/>
+          <w:b/>
+          <w:bCs/>
+          <w:sz w:val="24"/>
+          <w:szCs w:val="24"/>
+        </w:rPr>
+        <w:t xml:space="preserve">53.  </w:t>
+      </w:r>
+      <w:r>
+        <w:rPr>
+          <w:rFonts w:ascii="Arial" w:cs="Arial" w:eastAsia="Arial" w:hAnsi="Arial"/>
+          <w:sz w:val="24"/>
+          <w:szCs w:val="24"/>
+        </w:rPr>
+        <w:t xml:space="preserve">Where do the stuck beavers come from? Are they from other families?</w:t>
       </w:r>
     </w:p>
     <w:p>

</xml_diff>

<commit_message>
docs: record round 1 answers and add follow-up questions to round 2 (#13)
Co-authored-by: Richard Schuster <ric.schuster@proton.me>
Co-authored-by: Claude Sonnet 5.5 <noreply@anthropic.com>
</commit_message>
<xml_diff>
--- a/docs/design/02_game_questions_round2.docx
+++ b/docs/design/02_game_questions_round2.docx
@@ -41,7 +41,7 @@
           <w:sz w:val="24"/>
           <w:szCs w:val="24"/>
         </w:rPr>
-        <w:t xml:space="preserve">These questions fill in the details of the game. There are no wrong answers. Write short answers under each question. If you are not sure, write "not sure" and we can come back to it. Round 1 has the big questions.</w:t>
+        <w:t xml:space="preserve">These questions fill in the details of the game. There are no wrong answers. Write short answers under each question. If you are not sure, write "not sure" and we can come back to it. Round 1 has the big questions, and these new questions follow up on your round 1 answers.</w:t>
       </w:r>
     </w:p>
     <w:p>
@@ -1114,6 +1114,828 @@
           <w:szCs w:val="24"/>
         </w:rPr>
         <w:t xml:space="preserve">Is there a favorite part of the game that you can already picture? Tell us about it.</w:t>
+      </w:r>
+    </w:p>
+    <w:p>
+      <w:pPr>
+        <w:keepNext/>
+        <w:keepLines/>
+        <w:pBdr>
+          <w:bottom w:val="single" w:color="555555" w:sz="6" w:space="1"/>
+        </w:pBdr>
+        <w:spacing w:after="0" w:before="0" w:line="560" w:lineRule="exact"/>
+      </w:pPr>
+    </w:p>
+    <w:p>
+      <w:pPr>
+        <w:keepNext w:val="false"/>
+        <w:keepLines/>
+        <w:pBdr>
+          <w:bottom w:val="single" w:color="555556" w:sz="6" w:space="1"/>
+        </w:pBdr>
+        <w:spacing w:after="0" w:before="0" w:line="560" w:lineRule="exact"/>
+      </w:pPr>
+    </w:p>
+    <w:p>
+      <w:pPr>
+        <w:pStyle w:val="Heading1"/>
+        <w:keepNext/>
+        <w:spacing w:after="80" w:before="360"/>
+      </w:pPr>
+      <w:r>
+        <w:rPr>
+          <w:rFonts w:ascii="Arial" w:cs="Arial" w:eastAsia="Arial" w:hAnsi="Arial"/>
+          <w:b/>
+          <w:bCs/>
+          <w:sz w:val="30"/>
+          <w:szCs w:val="30"/>
+        </w:rPr>
+        <w:t xml:space="preserve">Tasks and achievements</w:t>
+      </w:r>
+    </w:p>
+    <w:p>
+      <w:pPr>
+        <w:keepNext/>
+        <w:spacing w:after="0" w:before="240"/>
+        <w:ind w:left="360" w:hanging="360"/>
+      </w:pPr>
+      <w:r>
+        <w:rPr>
+          <w:rFonts w:ascii="Arial" w:cs="Arial" w:eastAsia="Arial" w:hAnsi="Arial"/>
+          <w:b/>
+          <w:bCs/>
+          <w:sz w:val="24"/>
+          <w:szCs w:val="24"/>
+        </w:rPr>
+        <w:t xml:space="preserve">38.  </w:t>
+      </w:r>
+      <w:r>
+        <w:rPr>
+          <w:rFonts w:ascii="Arial" w:cs="Arial" w:eastAsia="Arial" w:hAnsi="Arial"/>
+          <w:sz w:val="24"/>
+          <w:szCs w:val="24"/>
+        </w:rPr>
+        <w:t xml:space="preserve">The goal is to complete each task and get every achievement. What are some tasks the beaver has to do?</w:t>
+      </w:r>
+    </w:p>
+    <w:p>
+      <w:pPr>
+        <w:keepNext/>
+        <w:keepLines/>
+        <w:pBdr>
+          <w:bottom w:val="single" w:color="555555" w:sz="6" w:space="1"/>
+        </w:pBdr>
+        <w:spacing w:after="0" w:before="0" w:line="560" w:lineRule="exact"/>
+      </w:pPr>
+    </w:p>
+    <w:p>
+      <w:pPr>
+        <w:keepNext w:val="false"/>
+        <w:keepLines/>
+        <w:pBdr>
+          <w:bottom w:val="single" w:color="555556" w:sz="6" w:space="1"/>
+        </w:pBdr>
+        <w:spacing w:after="0" w:before="0" w:line="560" w:lineRule="exact"/>
+      </w:pPr>
+    </w:p>
+    <w:p>
+      <w:pPr>
+        <w:keepNext/>
+        <w:spacing w:after="0" w:before="240"/>
+        <w:ind w:left="360" w:hanging="360"/>
+      </w:pPr>
+      <w:r>
+        <w:rPr>
+          <w:rFonts w:ascii="Arial" w:cs="Arial" w:eastAsia="Arial" w:hAnsi="Arial"/>
+          <w:b/>
+          <w:bCs/>
+          <w:sz w:val="24"/>
+          <w:szCs w:val="24"/>
+        </w:rPr>
+        <w:t xml:space="preserve">39.  </w:t>
+      </w:r>
+      <w:r>
+        <w:rPr>
+          <w:rFonts w:ascii="Arial" w:cs="Arial" w:eastAsia="Arial" w:hAnsi="Arial"/>
+          <w:sz w:val="24"/>
+          <w:szCs w:val="24"/>
+        </w:rPr>
+        <w:t xml:space="preserve">What is one achievement you can already picture? What would it be called?</w:t>
+      </w:r>
+    </w:p>
+    <w:p>
+      <w:pPr>
+        <w:keepNext/>
+        <w:keepLines/>
+        <w:pBdr>
+          <w:bottom w:val="single" w:color="555555" w:sz="6" w:space="1"/>
+        </w:pBdr>
+        <w:spacing w:after="0" w:before="0" w:line="560" w:lineRule="exact"/>
+      </w:pPr>
+    </w:p>
+    <w:p>
+      <w:pPr>
+        <w:keepNext w:val="false"/>
+        <w:keepLines/>
+        <w:pBdr>
+          <w:bottom w:val="single" w:color="555556" w:sz="6" w:space="1"/>
+        </w:pBdr>
+        <w:spacing w:after="0" w:before="0" w:line="560" w:lineRule="exact"/>
+      </w:pPr>
+    </w:p>
+    <w:p>
+      <w:pPr>
+        <w:keepNext/>
+        <w:spacing w:after="0" w:before="240"/>
+        <w:ind w:left="360" w:hanging="360"/>
+      </w:pPr>
+      <w:r>
+        <w:rPr>
+          <w:rFonts w:ascii="Arial" w:cs="Arial" w:eastAsia="Arial" w:hAnsi="Arial"/>
+          <w:b/>
+          <w:bCs/>
+          <w:sz w:val="24"/>
+          <w:szCs w:val="24"/>
+        </w:rPr>
+        <w:t xml:space="preserve">40.  </w:t>
+      </w:r>
+      <w:r>
+        <w:rPr>
+          <w:rFonts w:ascii="Arial" w:cs="Arial" w:eastAsia="Arial" w:hAnsi="Arial"/>
+          <w:sz w:val="24"/>
+          <w:szCs w:val="24"/>
+        </w:rPr>
+        <w:t xml:space="preserve">What happens when you have finished every task and got every achievement? Does the game end, or can you keep playing?</w:t>
+      </w:r>
+    </w:p>
+    <w:p>
+      <w:pPr>
+        <w:keepNext/>
+        <w:keepLines/>
+        <w:pBdr>
+          <w:bottom w:val="single" w:color="555555" w:sz="6" w:space="1"/>
+        </w:pBdr>
+        <w:spacing w:after="0" w:before="0" w:line="560" w:lineRule="exact"/>
+      </w:pPr>
+    </w:p>
+    <w:p>
+      <w:pPr>
+        <w:keepNext w:val="false"/>
+        <w:keepLines/>
+        <w:pBdr>
+          <w:bottom w:val="single" w:color="555556" w:sz="6" w:space="1"/>
+        </w:pBdr>
+        <w:spacing w:after="0" w:before="0" w:line="560" w:lineRule="exact"/>
+      </w:pPr>
+    </w:p>
+    <w:p>
+      <w:pPr>
+        <w:pStyle w:val="Heading1"/>
+        <w:keepNext/>
+        <w:spacing w:after="80" w:before="360"/>
+      </w:pPr>
+      <w:r>
+        <w:rPr>
+          <w:rFonts w:ascii="Arial" w:cs="Arial" w:eastAsia="Arial" w:hAnsi="Arial"/>
+          <w:b/>
+          <w:bCs/>
+          <w:sz w:val="30"/>
+          <w:szCs w:val="30"/>
+        </w:rPr>
+        <w:t xml:space="preserve">Playing with friends</w:t>
+      </w:r>
+    </w:p>
+    <w:p>
+      <w:pPr>
+        <w:keepNext/>
+        <w:spacing w:after="0" w:before="240"/>
+        <w:ind w:left="360" w:hanging="360"/>
+      </w:pPr>
+      <w:r>
+        <w:rPr>
+          <w:rFonts w:ascii="Arial" w:cs="Arial" w:eastAsia="Arial" w:hAnsi="Arial"/>
+          <w:b/>
+          <w:bCs/>
+          <w:sz w:val="24"/>
+          <w:szCs w:val="24"/>
+        </w:rPr>
+        <w:t xml:space="preserve">41.  </w:t>
+      </w:r>
+      <w:r>
+        <w:rPr>
+          <w:rFonts w:ascii="Arial" w:cs="Arial" w:eastAsia="Arial" w:hAnsi="Arial"/>
+          <w:sz w:val="24"/>
+          <w:szCs w:val="24"/>
+        </w:rPr>
+        <w:t xml:space="preserve">Friends can play together with different players. What does "different players" mean? Is each friend a different beaver in the same family?</w:t>
+      </w:r>
+    </w:p>
+    <w:p>
+      <w:pPr>
+        <w:keepNext/>
+        <w:keepLines/>
+        <w:pBdr>
+          <w:bottom w:val="single" w:color="555555" w:sz="6" w:space="1"/>
+        </w:pBdr>
+        <w:spacing w:after="0" w:before="0" w:line="560" w:lineRule="exact"/>
+      </w:pPr>
+    </w:p>
+    <w:p>
+      <w:pPr>
+        <w:keepNext w:val="false"/>
+        <w:keepLines/>
+        <w:pBdr>
+          <w:bottom w:val="single" w:color="555556" w:sz="6" w:space="1"/>
+        </w:pBdr>
+        <w:spacing w:after="0" w:before="0" w:line="560" w:lineRule="exact"/>
+      </w:pPr>
+    </w:p>
+    <w:p>
+      <w:pPr>
+        <w:pStyle w:val="Heading1"/>
+        <w:keepNext/>
+        <w:spacing w:after="80" w:before="360"/>
+      </w:pPr>
+      <w:r>
+        <w:rPr>
+          <w:rFonts w:ascii="Arial" w:cs="Arial" w:eastAsia="Arial" w:hAnsi="Arial"/>
+          <w:b/>
+          <w:bCs/>
+          <w:sz w:val="30"/>
+          <w:szCs w:val="30"/>
+        </w:rPr>
+        <w:t xml:space="preserve">Dreams and side quests</w:t>
+      </w:r>
+    </w:p>
+    <w:p>
+      <w:pPr>
+        <w:keepNext/>
+        <w:spacing w:after="0" w:before="240"/>
+        <w:ind w:left="360" w:hanging="360"/>
+      </w:pPr>
+      <w:r>
+        <w:rPr>
+          <w:rFonts w:ascii="Arial" w:cs="Arial" w:eastAsia="Arial" w:hAnsi="Arial"/>
+          <w:b/>
+          <w:bCs/>
+          <w:sz w:val="24"/>
+          <w:szCs w:val="24"/>
+        </w:rPr>
+        <w:t xml:space="preserve">42.  </w:t>
+      </w:r>
+      <w:r>
+        <w:rPr>
+          <w:rFonts w:ascii="Arial" w:cs="Arial" w:eastAsia="Arial" w:hAnsi="Arial"/>
+          <w:sz w:val="24"/>
+          <w:szCs w:val="24"/>
+        </w:rPr>
+        <w:t xml:space="preserve">How does the beaver go into a dream? Does it happen when it sleeps?</w:t>
+      </w:r>
+    </w:p>
+    <w:p>
+      <w:pPr>
+        <w:keepNext/>
+        <w:keepLines/>
+        <w:pBdr>
+          <w:bottom w:val="single" w:color="555555" w:sz="6" w:space="1"/>
+        </w:pBdr>
+        <w:spacing w:after="0" w:before="0" w:line="560" w:lineRule="exact"/>
+      </w:pPr>
+    </w:p>
+    <w:p>
+      <w:pPr>
+        <w:keepNext w:val="false"/>
+        <w:keepLines/>
+        <w:pBdr>
+          <w:bottom w:val="single" w:color="555556" w:sz="6" w:space="1"/>
+        </w:pBdr>
+        <w:spacing w:after="0" w:before="0" w:line="560" w:lineRule="exact"/>
+      </w:pPr>
+    </w:p>
+    <w:p>
+      <w:pPr>
+        <w:keepNext/>
+        <w:spacing w:after="0" w:before="240"/>
+        <w:ind w:left="360" w:hanging="360"/>
+      </w:pPr>
+      <w:r>
+        <w:rPr>
+          <w:rFonts w:ascii="Arial" w:cs="Arial" w:eastAsia="Arial" w:hAnsi="Arial"/>
+          <w:b/>
+          <w:bCs/>
+          <w:sz w:val="24"/>
+          <w:szCs w:val="24"/>
+        </w:rPr>
+        <w:t xml:space="preserve">43.  </w:t>
+      </w:r>
+      <w:r>
+        <w:rPr>
+          <w:rFonts w:ascii="Arial" w:cs="Arial" w:eastAsia="Arial" w:hAnsi="Arial"/>
+          <w:sz w:val="24"/>
+          <w:szCs w:val="24"/>
+        </w:rPr>
+        <w:t xml:space="preserve">What happens in a dream side quest? Tell us about one you can picture.</w:t>
+      </w:r>
+    </w:p>
+    <w:p>
+      <w:pPr>
+        <w:keepNext/>
+        <w:keepLines/>
+        <w:pBdr>
+          <w:bottom w:val="single" w:color="555555" w:sz="6" w:space="1"/>
+        </w:pBdr>
+        <w:spacing w:after="0" w:before="0" w:line="560" w:lineRule="exact"/>
+      </w:pPr>
+    </w:p>
+    <w:p>
+      <w:pPr>
+        <w:keepNext w:val="false"/>
+        <w:keepLines/>
+        <w:pBdr>
+          <w:bottom w:val="single" w:color="555556" w:sz="6" w:space="1"/>
+        </w:pBdr>
+        <w:spacing w:after="0" w:before="0" w:line="560" w:lineRule="exact"/>
+      </w:pPr>
+    </w:p>
+    <w:p>
+      <w:pPr>
+        <w:pStyle w:val="Heading1"/>
+        <w:keepNext/>
+        <w:spacing w:after="80" w:before="360"/>
+      </w:pPr>
+      <w:r>
+        <w:rPr>
+          <w:rFonts w:ascii="Arial" w:cs="Arial" w:eastAsia="Arial" w:hAnsi="Arial"/>
+          <w:b/>
+          <w:bCs/>
+          <w:sz w:val="30"/>
+          <w:szCs w:val="30"/>
+        </w:rPr>
+        <w:t xml:space="preserve">Seasons</w:t>
+      </w:r>
+    </w:p>
+    <w:p>
+      <w:pPr>
+        <w:keepNext/>
+        <w:spacing w:after="0" w:before="240"/>
+        <w:ind w:left="360" w:hanging="360"/>
+      </w:pPr>
+      <w:r>
+        <w:rPr>
+          <w:rFonts w:ascii="Arial" w:cs="Arial" w:eastAsia="Arial" w:hAnsi="Arial"/>
+          <w:b/>
+          <w:bCs/>
+          <w:sz w:val="24"/>
+          <w:szCs w:val="24"/>
+        </w:rPr>
+        <w:t xml:space="preserve">44.  </w:t>
+      </w:r>
+      <w:r>
+        <w:rPr>
+          <w:rFonts w:ascii="Arial" w:cs="Arial" w:eastAsia="Arial" w:hAnsi="Arial"/>
+          <w:sz w:val="24"/>
+          <w:szCs w:val="24"/>
+        </w:rPr>
+        <w:t xml:space="preserve">What are the seasons, and what changes in each one? Think about snow, ice on the pond, and food.</w:t>
+      </w:r>
+    </w:p>
+    <w:p>
+      <w:pPr>
+        <w:keepNext/>
+        <w:keepLines/>
+        <w:pBdr>
+          <w:bottom w:val="single" w:color="555555" w:sz="6" w:space="1"/>
+        </w:pBdr>
+        <w:spacing w:after="0" w:before="0" w:line="560" w:lineRule="exact"/>
+      </w:pPr>
+    </w:p>
+    <w:p>
+      <w:pPr>
+        <w:keepNext w:val="false"/>
+        <w:keepLines/>
+        <w:pBdr>
+          <w:bottom w:val="single" w:color="555556" w:sz="6" w:space="1"/>
+        </w:pBdr>
+        <w:spacing w:after="0" w:before="0" w:line="560" w:lineRule="exact"/>
+      </w:pPr>
+    </w:p>
+    <w:p>
+      <w:pPr>
+        <w:keepNext/>
+        <w:spacing w:after="0" w:before="240"/>
+        <w:ind w:left="360" w:hanging="360"/>
+      </w:pPr>
+      <w:r>
+        <w:rPr>
+          <w:rFonts w:ascii="Arial" w:cs="Arial" w:eastAsia="Arial" w:hAnsi="Arial"/>
+          <w:b/>
+          <w:bCs/>
+          <w:sz w:val="24"/>
+          <w:szCs w:val="24"/>
+        </w:rPr>
+        <w:t xml:space="preserve">45.  </w:t>
+      </w:r>
+      <w:r>
+        <w:rPr>
+          <w:rFonts w:ascii="Arial" w:cs="Arial" w:eastAsia="Arial" w:hAnsi="Arial"/>
+          <w:sz w:val="24"/>
+          <w:szCs w:val="24"/>
+        </w:rPr>
+        <w:t xml:space="preserve">What does the family do in winter? Where do the lily pads go?</w:t>
+      </w:r>
+    </w:p>
+    <w:p>
+      <w:pPr>
+        <w:keepNext/>
+        <w:keepLines/>
+        <w:pBdr>
+          <w:bottom w:val="single" w:color="555555" w:sz="6" w:space="1"/>
+        </w:pBdr>
+        <w:spacing w:after="0" w:before="0" w:line="560" w:lineRule="exact"/>
+      </w:pPr>
+    </w:p>
+    <w:p>
+      <w:pPr>
+        <w:keepNext w:val="false"/>
+        <w:keepLines/>
+        <w:pBdr>
+          <w:bottom w:val="single" w:color="555556" w:sz="6" w:space="1"/>
+        </w:pBdr>
+        <w:spacing w:after="0" w:before="0" w:line="560" w:lineRule="exact"/>
+      </w:pPr>
+    </w:p>
+    <w:p>
+      <w:pPr>
+        <w:keepNext/>
+        <w:spacing w:after="0" w:before="240"/>
+        <w:ind w:left="360" w:hanging="360"/>
+      </w:pPr>
+      <w:r>
+        <w:rPr>
+          <w:rFonts w:ascii="Arial" w:cs="Arial" w:eastAsia="Arial" w:hAnsi="Arial"/>
+          <w:b/>
+          <w:bCs/>
+          <w:sz w:val="24"/>
+          <w:szCs w:val="24"/>
+        </w:rPr>
+        <w:t xml:space="preserve">46.  </w:t>
+      </w:r>
+      <w:r>
+        <w:rPr>
+          <w:rFonts w:ascii="Arial" w:cs="Arial" w:eastAsia="Arial" w:hAnsi="Arial"/>
+          <w:sz w:val="24"/>
+          <w:szCs w:val="24"/>
+        </w:rPr>
+        <w:t xml:space="preserve">Does the game change when a season changes, or does it change slowly?</w:t>
+      </w:r>
+    </w:p>
+    <w:p>
+      <w:pPr>
+        <w:keepNext/>
+        <w:keepLines/>
+        <w:pBdr>
+          <w:bottom w:val="single" w:color="555555" w:sz="6" w:space="1"/>
+        </w:pBdr>
+        <w:spacing w:after="0" w:before="0" w:line="560" w:lineRule="exact"/>
+      </w:pPr>
+    </w:p>
+    <w:p>
+      <w:pPr>
+        <w:keepNext w:val="false"/>
+        <w:keepLines/>
+        <w:pBdr>
+          <w:bottom w:val="single" w:color="555556" w:sz="6" w:space="1"/>
+        </w:pBdr>
+        <w:spacing w:after="0" w:before="0" w:line="560" w:lineRule="exact"/>
+      </w:pPr>
+    </w:p>
+    <w:p>
+      <w:pPr>
+        <w:pStyle w:val="Heading1"/>
+        <w:keepNext/>
+        <w:spacing w:after="80" w:before="360"/>
+      </w:pPr>
+      <w:r>
+        <w:rPr>
+          <w:rFonts w:ascii="Arial" w:cs="Arial" w:eastAsia="Arial" w:hAnsi="Arial"/>
+          <w:b/>
+          <w:bCs/>
+          <w:sz w:val="30"/>
+          <w:szCs w:val="30"/>
+        </w:rPr>
+        <w:t xml:space="preserve">Growing up and the family</w:t>
+      </w:r>
+    </w:p>
+    <w:p>
+      <w:pPr>
+        <w:keepNext/>
+        <w:spacing w:after="0" w:before="240"/>
+        <w:ind w:left="360" w:hanging="360"/>
+      </w:pPr>
+      <w:r>
+        <w:rPr>
+          <w:rFonts w:ascii="Arial" w:cs="Arial" w:eastAsia="Arial" w:hAnsi="Arial"/>
+          <w:b/>
+          <w:bCs/>
+          <w:sz w:val="24"/>
+          <w:szCs w:val="24"/>
+        </w:rPr>
+        <w:t xml:space="preserve">47.  </w:t>
+      </w:r>
+      <w:r>
+        <w:rPr>
+          <w:rFonts w:ascii="Arial" w:cs="Arial" w:eastAsia="Arial" w:hAnsi="Arial"/>
+          <w:sz w:val="24"/>
+          <w:szCs w:val="24"/>
+        </w:rPr>
+        <w:t xml:space="preserve">A baby takes one year to become a teenager. Do you play the whole year, or does time jump ahead?</w:t>
+      </w:r>
+    </w:p>
+    <w:p>
+      <w:pPr>
+        <w:keepNext/>
+        <w:keepLines/>
+        <w:pBdr>
+          <w:bottom w:val="single" w:color="555555" w:sz="6" w:space="1"/>
+        </w:pBdr>
+        <w:spacing w:after="0" w:before="0" w:line="560" w:lineRule="exact"/>
+      </w:pPr>
+    </w:p>
+    <w:p>
+      <w:pPr>
+        <w:keepNext w:val="false"/>
+        <w:keepLines/>
+        <w:pBdr>
+          <w:bottom w:val="single" w:color="555556" w:sz="6" w:space="1"/>
+        </w:pBdr>
+        <w:spacing w:after="0" w:before="0" w:line="560" w:lineRule="exact"/>
+      </w:pPr>
+    </w:p>
+    <w:p>
+      <w:pPr>
+        <w:keepNext/>
+        <w:spacing w:after="0" w:before="240"/>
+        <w:ind w:left="360" w:hanging="360"/>
+      </w:pPr>
+      <w:r>
+        <w:rPr>
+          <w:rFonts w:ascii="Arial" w:cs="Arial" w:eastAsia="Arial" w:hAnsi="Arial"/>
+          <w:b/>
+          <w:bCs/>
+          <w:sz w:val="24"/>
+          <w:szCs w:val="24"/>
+        </w:rPr>
+        <w:t xml:space="preserve">48.  </w:t>
+      </w:r>
+      <w:r>
+        <w:rPr>
+          <w:rFonts w:ascii="Arial" w:cs="Arial" w:eastAsia="Arial" w:hAnsi="Arial"/>
+          <w:sz w:val="24"/>
+          <w:szCs w:val="24"/>
+        </w:rPr>
+        <w:t xml:space="preserve">Teenagers help out around the pond. What jobs do they do?</w:t>
+      </w:r>
+    </w:p>
+    <w:p>
+      <w:pPr>
+        <w:keepNext/>
+        <w:keepLines/>
+        <w:pBdr>
+          <w:bottom w:val="single" w:color="555555" w:sz="6" w:space="1"/>
+        </w:pBdr>
+        <w:spacing w:after="0" w:before="0" w:line="560" w:lineRule="exact"/>
+      </w:pPr>
+    </w:p>
+    <w:p>
+      <w:pPr>
+        <w:keepNext w:val="false"/>
+        <w:keepLines/>
+        <w:pBdr>
+          <w:bottom w:val="single" w:color="555556" w:sz="6" w:space="1"/>
+        </w:pBdr>
+        <w:spacing w:after="0" w:before="0" w:line="560" w:lineRule="exact"/>
+      </w:pPr>
+    </w:p>
+    <w:p>
+      <w:pPr>
+        <w:keepNext/>
+        <w:spacing w:after="0" w:before="240"/>
+        <w:ind w:left="360" w:hanging="360"/>
+      </w:pPr>
+      <w:r>
+        <w:rPr>
+          <w:rFonts w:ascii="Arial" w:cs="Arial" w:eastAsia="Arial" w:hAnsi="Arial"/>
+          <w:b/>
+          <w:bCs/>
+          <w:sz w:val="24"/>
+          <w:szCs w:val="24"/>
+        </w:rPr>
+        <w:t xml:space="preserve">49.  </w:t>
+      </w:r>
+      <w:r>
+        <w:rPr>
+          <w:rFonts w:ascii="Arial" w:cs="Arial" w:eastAsia="Arial" w:hAnsi="Arial"/>
+          <w:sz w:val="24"/>
+          <w:szCs w:val="24"/>
+        </w:rPr>
+        <w:t xml:space="preserve">What does papa beaver do?</w:t>
+      </w:r>
+    </w:p>
+    <w:p>
+      <w:pPr>
+        <w:keepNext/>
+        <w:keepLines/>
+        <w:pBdr>
+          <w:bottom w:val="single" w:color="555555" w:sz="6" w:space="1"/>
+        </w:pBdr>
+        <w:spacing w:after="0" w:before="0" w:line="560" w:lineRule="exact"/>
+      </w:pPr>
+    </w:p>
+    <w:p>
+      <w:pPr>
+        <w:keepNext w:val="false"/>
+        <w:keepLines/>
+        <w:pBdr>
+          <w:bottom w:val="single" w:color="555556" w:sz="6" w:space="1"/>
+        </w:pBdr>
+        <w:spacing w:after="0" w:before="0" w:line="560" w:lineRule="exact"/>
+      </w:pPr>
+    </w:p>
+    <w:p>
+      <w:pPr>
+        <w:keepNext/>
+        <w:spacing w:after="0" w:before="240"/>
+        <w:ind w:left="360" w:hanging="360"/>
+      </w:pPr>
+      <w:r>
+        <w:rPr>
+          <w:rFonts w:ascii="Arial" w:cs="Arial" w:eastAsia="Arial" w:hAnsi="Arial"/>
+          <w:b/>
+          <w:bCs/>
+          <w:sz w:val="24"/>
+          <w:szCs w:val="24"/>
+        </w:rPr>
+        <w:t xml:space="preserve">50.  </w:t>
+      </w:r>
+      <w:r>
+        <w:rPr>
+          <w:rFonts w:ascii="Arial" w:cs="Arial" w:eastAsia="Arial" w:hAnsi="Arial"/>
+          <w:sz w:val="24"/>
+          <w:szCs w:val="24"/>
+        </w:rPr>
+        <w:t xml:space="preserve">The teenager stays one more year, and then starts a family of its own. How do you know it is time to go? Does the family say goodbye?</w:t>
+      </w:r>
+    </w:p>
+    <w:p>
+      <w:pPr>
+        <w:keepNext/>
+        <w:keepLines/>
+        <w:pBdr>
+          <w:bottom w:val="single" w:color="555555" w:sz="6" w:space="1"/>
+        </w:pBdr>
+        <w:spacing w:after="0" w:before="0" w:line="560" w:lineRule="exact"/>
+      </w:pPr>
+    </w:p>
+    <w:p>
+      <w:pPr>
+        <w:keepNext w:val="false"/>
+        <w:keepLines/>
+        <w:pBdr>
+          <w:bottom w:val="single" w:color="555556" w:sz="6" w:space="1"/>
+        </w:pBdr>
+        <w:spacing w:after="0" w:before="0" w:line="560" w:lineRule="exact"/>
+      </w:pPr>
+    </w:p>
+    <w:p>
+      <w:pPr>
+        <w:pStyle w:val="Heading1"/>
+        <w:keepNext/>
+        <w:spacing w:after="80" w:before="360"/>
+      </w:pPr>
+      <w:r>
+        <w:rPr>
+          <w:rFonts w:ascii="Arial" w:cs="Arial" w:eastAsia="Arial" w:hAnsi="Arial"/>
+          <w:b/>
+          <w:bCs/>
+          <w:sz w:val="30"/>
+          <w:szCs w:val="30"/>
+        </w:rPr>
+        <w:t xml:space="preserve">Guides and rescues</w:t>
+      </w:r>
+    </w:p>
+    <w:p>
+      <w:pPr>
+        <w:keepNext/>
+        <w:spacing w:after="0" w:before="240"/>
+        <w:ind w:left="360" w:hanging="360"/>
+      </w:pPr>
+      <w:r>
+        <w:rPr>
+          <w:rFonts w:ascii="Arial" w:cs="Arial" w:eastAsia="Arial" w:hAnsi="Arial"/>
+          <w:b/>
+          <w:bCs/>
+          <w:sz w:val="24"/>
+          <w:szCs w:val="24"/>
+        </w:rPr>
+        <w:t xml:space="preserve">51.  </w:t>
+      </w:r>
+      <w:r>
+        <w:rPr>
+          <w:rFonts w:ascii="Arial" w:cs="Arial" w:eastAsia="Arial" w:hAnsi="Arial"/>
+          <w:sz w:val="24"/>
+          <w:szCs w:val="24"/>
+        </w:rPr>
+        <w:t xml:space="preserve">A stuck beaver is not the player, but it can become your guide once you rescue it. What does a guide do for you?</w:t>
+      </w:r>
+    </w:p>
+    <w:p>
+      <w:pPr>
+        <w:keepNext/>
+        <w:keepLines/>
+        <w:pBdr>
+          <w:bottom w:val="single" w:color="555555" w:sz="6" w:space="1"/>
+        </w:pBdr>
+        <w:spacing w:after="0" w:before="0" w:line="560" w:lineRule="exact"/>
+      </w:pPr>
+    </w:p>
+    <w:p>
+      <w:pPr>
+        <w:keepNext w:val="false"/>
+        <w:keepLines/>
+        <w:pBdr>
+          <w:bottom w:val="single" w:color="555556" w:sz="6" w:space="1"/>
+        </w:pBdr>
+        <w:spacing w:after="0" w:before="0" w:line="560" w:lineRule="exact"/>
+      </w:pPr>
+    </w:p>
+    <w:p>
+      <w:pPr>
+        <w:keepNext/>
+        <w:spacing w:after="0" w:before="240"/>
+        <w:ind w:left="360" w:hanging="360"/>
+      </w:pPr>
+      <w:r>
+        <w:rPr>
+          <w:rFonts w:ascii="Arial" w:cs="Arial" w:eastAsia="Arial" w:hAnsi="Arial"/>
+          <w:b/>
+          <w:bCs/>
+          <w:sz w:val="24"/>
+          <w:szCs w:val="24"/>
+        </w:rPr>
+        <w:t xml:space="preserve">52.  </w:t>
+      </w:r>
+      <w:r>
+        <w:rPr>
+          <w:rFonts w:ascii="Arial" w:cs="Arial" w:eastAsia="Arial" w:hAnsi="Arial"/>
+          <w:sz w:val="24"/>
+          <w:szCs w:val="24"/>
+        </w:rPr>
+        <w:t xml:space="preserve">How do you rescue a stuck beaver? What does the player do?</w:t>
+      </w:r>
+    </w:p>
+    <w:p>
+      <w:pPr>
+        <w:keepNext/>
+        <w:keepLines/>
+        <w:pBdr>
+          <w:bottom w:val="single" w:color="555555" w:sz="6" w:space="1"/>
+        </w:pBdr>
+        <w:spacing w:after="0" w:before="0" w:line="560" w:lineRule="exact"/>
+      </w:pPr>
+    </w:p>
+    <w:p>
+      <w:pPr>
+        <w:keepNext w:val="false"/>
+        <w:keepLines/>
+        <w:pBdr>
+          <w:bottom w:val="single" w:color="555556" w:sz="6" w:space="1"/>
+        </w:pBdr>
+        <w:spacing w:after="0" w:before="0" w:line="560" w:lineRule="exact"/>
+      </w:pPr>
+    </w:p>
+    <w:p>
+      <w:pPr>
+        <w:keepNext/>
+        <w:spacing w:after="0" w:before="240"/>
+        <w:ind w:left="360" w:hanging="360"/>
+      </w:pPr>
+      <w:r>
+        <w:rPr>
+          <w:rFonts w:ascii="Arial" w:cs="Arial" w:eastAsia="Arial" w:hAnsi="Arial"/>
+          <w:b/>
+          <w:bCs/>
+          <w:sz w:val="24"/>
+          <w:szCs w:val="24"/>
+        </w:rPr>
+        <w:t xml:space="preserve">53.  </w:t>
+      </w:r>
+      <w:r>
+        <w:rPr>
+          <w:rFonts w:ascii="Arial" w:cs="Arial" w:eastAsia="Arial" w:hAnsi="Arial"/>
+          <w:sz w:val="24"/>
+          <w:szCs w:val="24"/>
+        </w:rPr>
+        <w:t xml:space="preserve">Where do the stuck beavers come from? Are they from other families?</w:t>
       </w:r>
     </w:p>
     <w:p>

</xml_diff>